<commit_message>
Update Word doc with prominent live website URL on cover page
Co-Authored-By: Claude Sonnet 4.6 <noreply@anthropic.com>
</commit_message>
<xml_diff>
--- a/RPA_Week2_Screenshots.docx
+++ b/RPA_Week2_Screenshots.docx
@@ -63,12 +63,17 @@
       </w:r>
     </w:p>
     <w:p>
+      <w:pPr>
+        <w:jc w:val="center"/>
+        <w:shd w:val="clear" w:color="auto" w:fill="e8f4fd"/>
+      </w:pPr>
       <w:r>
         <w:rPr>
+          <w:b/>
           <w:color w:val="0077CC"/>
-          <w:sz w:val="22"/>
+          <w:sz w:val="24"/>
         </w:rPr>
-        <w:t>https://omais-eng.github.io/rpa/assignment2/index.html</w:t>
+        <w:t>OPEN WEBSITE: https://omais-eng.github.io/rpa/assignment2/index.html</w:t>
       </w:r>
     </w:p>
     <w:p>
@@ -85,12 +90,16 @@
       </w:r>
     </w:p>
     <w:p>
+      <w:pPr>
+        <w:jc w:val="center"/>
+      </w:pPr>
       <w:r>
         <w:rPr>
-          <w:color w:val="0077CC"/>
+          <w:b/>
+          <w:color w:val="1E3A5F"/>
           <w:sz w:val="22"/>
         </w:rPr>
-        <w:t>https://github.com/omais-eng/rpa</w:t>
+        <w:t>GitHub: https://github.com/omais-eng/rpa</w:t>
       </w:r>
     </w:p>
     <w:p/>

</xml_diff>